<commit_message>
feat(web): implement flag color comparison page and update specs
- Add 05_web/colors.html, css/colors.css, js/colors.js for color analysis

- Add "Color Analysis" link to all page navigation bars

- Update 06_docs with flag color rules Excel, raw text, and MOFA PDFs

- Safely update .gitignore to exclude id_rsa and AI logs
</commit_message>
<xml_diff>
--- a/06_docs/国名・首都名_変更一覧_20260512.docx
+++ b/06_docs/国名・首都名_変更一覧_20260512.docx
@@ -167,7 +167,7 @@
         <w:tc>
           <w:tcPr>
             <w:tcW w:w="2880" w:type="dxa"/>
-            <w:shd w:val="clear" w:color="auto" w:fill="D9E2F3"/>
+            <w:shd w:val="clear" w:color="auto" w:fill="D9D9D9" w:themeFill="background1" w:themeFillShade="D9"/>
           </w:tcPr>
           <w:p>
             <w:pPr>
@@ -190,7 +190,7 @@
         <w:tc>
           <w:tcPr>
             <w:tcW w:w="2880" w:type="dxa"/>
-            <w:shd w:val="clear" w:color="auto" w:fill="D9E2F3"/>
+            <w:shd w:val="clear" w:color="auto" w:fill="D9D9D9" w:themeFill="background1" w:themeFillShade="D9"/>
           </w:tcPr>
           <w:p>
             <w:pPr>
@@ -211,7 +211,7 @@
         <w:tc>
           <w:tcPr>
             <w:tcW w:w="2880" w:type="dxa"/>
-            <w:shd w:val="clear" w:color="auto" w:fill="D9E2F3"/>
+            <w:shd w:val="clear" w:color="auto" w:fill="D9D9D9" w:themeFill="background1" w:themeFillShade="D9"/>
           </w:tcPr>
           <w:p>
             <w:pPr>
@@ -522,7 +522,7 @@
         <w:tc>
           <w:tcPr>
             <w:tcW w:w="2880" w:type="dxa"/>
-            <w:shd w:val="clear" w:color="auto" w:fill="D9E2F3"/>
+            <w:shd w:val="clear" w:color="auto" w:fill="D9D9D9" w:themeFill="background1" w:themeFillShade="D9"/>
           </w:tcPr>
           <w:p>
             <w:pPr>
@@ -545,7 +545,7 @@
         <w:tc>
           <w:tcPr>
             <w:tcW w:w="2880" w:type="dxa"/>
-            <w:shd w:val="clear" w:color="auto" w:fill="D9E2F3"/>
+            <w:shd w:val="clear" w:color="auto" w:fill="D9D9D9" w:themeFill="background1" w:themeFillShade="D9"/>
           </w:tcPr>
           <w:p>
             <w:pPr>
@@ -566,7 +566,7 @@
         <w:tc>
           <w:tcPr>
             <w:tcW w:w="2880" w:type="dxa"/>
-            <w:shd w:val="clear" w:color="auto" w:fill="D9E2F3"/>
+            <w:shd w:val="clear" w:color="auto" w:fill="D9D9D9" w:themeFill="background1" w:themeFillShade="D9"/>
           </w:tcPr>
           <w:p>
             <w:pPr>
@@ -786,55 +786,7 @@
           <w:sz w:val="18"/>
           <w:lang w:eastAsia="ja-JP"/>
         </w:rPr>
-        <w:fldChar w:fldCharType="begin"/>
-      </w:r>
-      <w:r>
-        <w:rPr>
-          <w:color w:val="000000" w:themeColor="text1"/>
-          <w:sz w:val="18"/>
-          <w:lang w:eastAsia="ja-JP"/>
-        </w:rPr>
-        <w:instrText>HYPERLINK "</w:instrText>
-      </w:r>
-      <w:r>
-        <w:rPr>
-          <w:color w:val="000000" w:themeColor="text1"/>
-          <w:sz w:val="18"/>
-          <w:lang w:eastAsia="ja-JP"/>
-        </w:rPr>
-        <w:instrText>https://www.lv.emb-japan.go.jp/itpr_ja/11_000001_00547.html</w:instrText>
-      </w:r>
-      <w:r>
-        <w:rPr>
-          <w:color w:val="000000" w:themeColor="text1"/>
-          <w:sz w:val="18"/>
-          <w:lang w:eastAsia="ja-JP"/>
-        </w:rPr>
-        <w:instrText>"</w:instrText>
-      </w:r>
-      <w:r>
-        <w:rPr>
-          <w:color w:val="000000" w:themeColor="text1"/>
-          <w:sz w:val="18"/>
-          <w:lang w:eastAsia="ja-JP"/>
-        </w:rPr>
-        <w:fldChar w:fldCharType="separate"/>
-      </w:r>
-      <w:r>
-        <w:rPr>
-          <w:rStyle w:val="aff"/>
-          <w:sz w:val="18"/>
-          <w:lang w:eastAsia="ja-JP"/>
-        </w:rPr>
         <w:t>https://www.lv.emb-japan.go.jp/itpr_ja/11_000001_00547.html</w:t>
-      </w:r>
-      <w:r>
-        <w:rPr>
-          <w:color w:val="000000" w:themeColor="text1"/>
-          <w:sz w:val="18"/>
-          <w:lang w:eastAsia="ja-JP"/>
-        </w:rPr>
-        <w:fldChar w:fldCharType="end"/>
       </w:r>
     </w:p>
     <w:p>
@@ -904,7 +856,7 @@
         <w:tc>
           <w:tcPr>
             <w:tcW w:w="2880" w:type="dxa"/>
-            <w:shd w:val="clear" w:color="auto" w:fill="D9E2F3"/>
+            <w:shd w:val="clear" w:color="auto" w:fill="D9D9D9" w:themeFill="background1" w:themeFillShade="D9"/>
           </w:tcPr>
           <w:p>
             <w:pPr>
@@ -927,7 +879,7 @@
         <w:tc>
           <w:tcPr>
             <w:tcW w:w="2880" w:type="dxa"/>
-            <w:shd w:val="clear" w:color="auto" w:fill="D9E2F3"/>
+            <w:shd w:val="clear" w:color="auto" w:fill="D9D9D9" w:themeFill="background1" w:themeFillShade="D9"/>
           </w:tcPr>
           <w:p>
             <w:pPr>
@@ -948,7 +900,7 @@
         <w:tc>
           <w:tcPr>
             <w:tcW w:w="2880" w:type="dxa"/>
-            <w:shd w:val="clear" w:color="auto" w:fill="D9E2F3"/>
+            <w:shd w:val="clear" w:color="auto" w:fill="D9D9D9" w:themeFill="background1" w:themeFillShade="D9"/>
           </w:tcPr>
           <w:p>
             <w:pPr>
@@ -1204,7 +1156,7 @@
         <w:tc>
           <w:tcPr>
             <w:tcW w:w="2880" w:type="dxa"/>
-            <w:shd w:val="clear" w:color="auto" w:fill="D9E2F3"/>
+            <w:shd w:val="clear" w:color="auto" w:fill="D9D9D9" w:themeFill="background1" w:themeFillShade="D9"/>
           </w:tcPr>
           <w:p>
             <w:pPr>
@@ -1227,7 +1179,7 @@
         <w:tc>
           <w:tcPr>
             <w:tcW w:w="2880" w:type="dxa"/>
-            <w:shd w:val="clear" w:color="auto" w:fill="D9E2F3"/>
+            <w:shd w:val="clear" w:color="auto" w:fill="D9D9D9" w:themeFill="background1" w:themeFillShade="D9"/>
           </w:tcPr>
           <w:p>
             <w:pPr>
@@ -1248,7 +1200,7 @@
         <w:tc>
           <w:tcPr>
             <w:tcW w:w="2880" w:type="dxa"/>
-            <w:shd w:val="clear" w:color="auto" w:fill="D9E2F3"/>
+            <w:shd w:val="clear" w:color="auto" w:fill="D9D9D9" w:themeFill="background1" w:themeFillShade="D9"/>
           </w:tcPr>
           <w:p>
             <w:pPr>
@@ -1427,7 +1379,41 @@
           <w:sz w:val="18"/>
           <w:lang w:eastAsia="ja-JP"/>
         </w:rPr>
-        <w:t xml:space="preserve"> 外務省 data.html 上の正式名称表記に略称「UAE」がコロン付きで追記された。国名そのものの変更ではなく、表記上の補足と思われる。公的な変更告知は確認されていない。</w:t>
+        <w:t xml:space="preserve"> 外務省 </w:t>
+      </w:r>
+      <w:r>
+        <w:rPr>
+          <w:rFonts w:hint="eastAsia"/>
+          <w:color w:val="000000" w:themeColor="text1"/>
+          <w:sz w:val="18"/>
+          <w:lang w:eastAsia="ja-JP"/>
+        </w:rPr>
+        <w:t>「国・地域」</w:t>
+      </w:r>
+      <w:r>
+        <w:rPr>
+          <w:color w:val="000000" w:themeColor="text1"/>
+          <w:sz w:val="18"/>
+          <w:lang w:eastAsia="ja-JP"/>
+        </w:rPr>
+        <w:t>の</w:t>
+      </w:r>
+      <w:r>
+        <w:rPr>
+          <w:rFonts w:hint="eastAsia"/>
+          <w:color w:val="000000" w:themeColor="text1"/>
+          <w:sz w:val="18"/>
+          <w:lang w:eastAsia="ja-JP"/>
+        </w:rPr>
+        <w:t>英文国名</w:t>
+      </w:r>
+      <w:r>
+        <w:rPr>
+          <w:color w:val="000000" w:themeColor="text1"/>
+          <w:sz w:val="18"/>
+          <w:lang w:eastAsia="ja-JP"/>
+        </w:rPr>
+        <w:t>表記に略称「UAE」がコロン付きで追記された。国名そのものの変更ではなく、表記上の補足と思われる。公的な変更告知は確認されていない。</w:t>
       </w:r>
     </w:p>
     <w:sectPr>

</xml_diff>